<commit_message>
feat(repo): deliver canonical English research package, computational notebook, translated figures, and synchronized documentation
</commit_message>
<xml_diff>
--- a/paper/English/Paper_Mensajes_Presidenciales_Mercados_Colombia_EN.docx
+++ b/paper/English/Paper_Mensajes_Presidenciales_Mercados_Colombia_EN.docx
@@ -1296,7 +1296,7 @@
                     <a:graphicData uri="http://schemas.openxmlformats.org/drawingml/2006/picture">
                       <pic:pic>
                         <pic:nvPicPr>
-                          <pic:cNvPr descr="../../paper/español/figures/plutchik_rueda_emociones_en.png" id="28" name="Picture"/>
+                          <pic:cNvPr descr="../figures/English/figura1_plutchik.png" id="28" name="Picture"/>
                           <pic:cNvPicPr>
                             <a:picLocks noChangeArrowheads="1" noChangeAspect="1"/>
                           </pic:cNvPicPr>
@@ -4333,7 +4333,7 @@
                     <a:graphicData uri="http://schemas.openxmlformats.org/drawingml/2006/picture">
                       <pic:pic>
                         <pic:nvPicPr>
-                          <pic:cNvPr descr="../../output/figures/español/sentimiento_emociones_diarias.png" id="43" name="Picture"/>
+                          <pic:cNvPr descr="../figures/English/sentimiento_emociones_diarias.png" id="43" name="Picture"/>
                           <pic:cNvPicPr>
                             <a:picLocks noChangeArrowheads="1" noChangeAspect="1"/>
                           </pic:cNvPicPr>
@@ -4420,7 +4420,7 @@
                     <a:graphicData uri="http://schemas.openxmlformats.org/drawingml/2006/picture">
                       <pic:pic>
                         <pic:nvPicPr>
-                          <pic:cNvPr descr="../../output/figures/español/wordcloud_sentimientos_nrc.png" id="47" name="Picture"/>
+                          <pic:cNvPr descr="../figures/English/wordcloud_sentimientos_nrc.png" id="47" name="Picture"/>
                           <pic:cNvPicPr>
                             <a:picLocks noChangeArrowheads="1" noChangeAspect="1"/>
                           </pic:cNvPicPr>
@@ -6107,7 +6107,7 @@
                     <a:graphicData uri="http://schemas.openxmlformats.org/drawingml/2006/picture">
                       <pic:pic>
                         <pic:nvPicPr>
-                          <pic:cNvPr descr="../../output/figures/español/comparacion_corpus_volumen.png" id="58" name="Picture"/>
+                          <pic:cNvPr descr="../figures/English/comparacion_corpus_volumen.png" id="58" name="Picture"/>
                           <pic:cNvPicPr>
                             <a:picLocks noChangeArrowheads="1" noChangeAspect="1"/>
                           </pic:cNvPicPr>
@@ -6363,7 +6363,7 @@
                     <a:graphicData uri="http://schemas.openxmlformats.org/drawingml/2006/picture">
                       <pic:pic>
                         <pic:nvPicPr>
-                          <pic:cNvPr descr="../../output/figures/español/ipi_serie_diaria.png" id="63" name="Picture"/>
+                          <pic:cNvPr descr="../figures/English/ipi_serie_diaria.png" id="63" name="Picture"/>
                           <pic:cNvPicPr>
                             <a:picLocks noChangeArrowheads="1" noChangeAspect="1"/>
                           </pic:cNvPicPr>
@@ -6481,14 +6481,14 @@
             <w:r>
               <w:drawing>
                 <wp:inline>
-                  <wp:extent cx="5646420" cy="4234815"/>
+                  <wp:extent cx="5646420" cy="4317850"/>
                   <wp:effectExtent b="0" l="0" r="0" t="0"/>
                   <wp:docPr descr="" title="" id="67" name="Picture"/>
                   <a:graphic>
                     <a:graphicData uri="http://schemas.openxmlformats.org/drawingml/2006/picture">
                       <pic:pic>
                         <pic:nvPicPr>
-                          <pic:cNvPr descr="../../output/figures/español/temas_reforma_resumen.png" id="68" name="Picture"/>
+                          <pic:cNvPr descr="../figures/English/temas_reforma_resumen.png" id="68" name="Picture"/>
                           <pic:cNvPicPr>
                             <a:picLocks noChangeArrowheads="1" noChangeAspect="1"/>
                           </pic:cNvPicPr>
@@ -6502,7 +6502,7 @@
                         <pic:spPr bwMode="auto">
                           <a:xfrm>
                             <a:off x="0" y="0"/>
-                            <a:ext cx="5646420" cy="4234815"/>
+                            <a:ext cx="5646420" cy="4317850"/>
                           </a:xfrm>
                           <a:prstGeom prst="rect">
                             <a:avLst/>
@@ -7089,7 +7089,7 @@
                     <a:graphicData uri="http://schemas.openxmlformats.org/drawingml/2006/picture">
                       <pic:pic>
                         <pic:nvPicPr>
-                          <pic:cNvPr descr="../../output/figures/español/econometria/dcc_correlaciones_dinamicas_panel.png" id="74" name="Picture"/>
+                          <pic:cNvPr descr="../figures/English/econometria/dcc_correlaciones_dinamicas_panel.png" id="74" name="Picture"/>
                           <pic:cNvPicPr>
                             <a:picLocks noChangeArrowheads="1" noChangeAspect="1"/>
                           </pic:cNvPicPr>
@@ -8072,7 +8072,7 @@
                           <a:graphicData uri="http://schemas.openxmlformats.org/drawingml/2006/picture">
                             <pic:pic>
                               <pic:nvPicPr>
-                                <pic:cNvPr descr="../../output/figures/español/granger_trm_colcap.png" id="80" name="Picture"/>
+                                <pic:cNvPr descr="../figures/English/granger_trm_colcap.png" id="80" name="Picture"/>
                                 <pic:cNvPicPr>
                                   <a:picLocks noChangeArrowheads="1" noChangeAspect="1"/>
                                 </pic:cNvPicPr>
@@ -8190,14 +8190,14 @@
                   <w:r>
                     <w:drawing>
                       <wp:inline>
-                        <wp:extent cx="2971800" cy="1931670"/>
+                        <wp:extent cx="2971800" cy="1891145"/>
                         <wp:effectExtent b="0" l="0" r="0" t="0"/>
                         <wp:docPr descr="" title="" id="83" name="Picture"/>
                         <a:graphic>
                           <a:graphicData uri="http://schemas.openxmlformats.org/drawingml/2006/picture">
                             <pic:pic>
                               <pic:nvPicPr>
-                                <pic:cNvPr descr="../../output/figures/español/granger_presidencial_emociones.png" id="84" name="Picture"/>
+                                <pic:cNvPr descr="../figures/English/granger_presidencial_emociones.png" id="84" name="Picture"/>
                                 <pic:cNvPicPr>
                                   <a:picLocks noChangeArrowheads="1" noChangeAspect="1"/>
                                 </pic:cNvPicPr>
@@ -8211,7 +8211,7 @@
                               <pic:spPr bwMode="auto">
                                 <a:xfrm>
                                   <a:off x="0" y="0"/>
-                                  <a:ext cx="2971800" cy="1931670"/>
+                                  <a:ext cx="2971800" cy="1891145"/>
                                 </a:xfrm>
                                 <a:prstGeom prst="rect">
                                   <a:avLst/>
@@ -9450,14 +9450,14 @@
             <w:r>
               <w:drawing>
                 <wp:inline>
-                  <wp:extent cx="5646420" cy="3136900"/>
+                  <wp:extent cx="5646420" cy="3268980"/>
                   <wp:effectExtent b="0" l="0" r="0" t="0"/>
                   <wp:docPr descr="" title="" id="90" name="Picture"/>
                   <a:graphic>
                     <a:graphicData uri="http://schemas.openxmlformats.org/drawingml/2006/picture">
                       <pic:pic>
                         <pic:nvPicPr>
-                          <pic:cNvPr descr="../../output/figures/español/event_study_respuestas_heatmap.png" id="91" name="Picture"/>
+                          <pic:cNvPr descr="../figures/English/event_study_respuestas_heatmap.png" id="91" name="Picture"/>
                           <pic:cNvPicPr>
                             <a:picLocks noChangeArrowheads="1" noChangeAspect="1"/>
                           </pic:cNvPicPr>
@@ -9471,7 +9471,7 @@
                         <pic:spPr bwMode="auto">
                           <a:xfrm>
                             <a:off x="0" y="0"/>
-                            <a:ext cx="5646420" cy="3136900"/>
+                            <a:ext cx="5646420" cy="3268980"/>
                           </a:xfrm>
                           <a:prstGeom prst="rect">
                             <a:avLst/>

</xml_diff>